<commit_message>
small change to docs folder file arrangement
</commit_message>
<xml_diff>
--- a/docs/superceded/Detailed_workflow_rev0.docx
+++ b/docs/superceded/Detailed_workflow_rev0.docx
@@ -3828,538 +3828,6 @@
         </w:rPr>
         <w:t>Refine NER model with more data/tuning.</w:t>
       </w:r>
-    </w:p>
-    <w:p>
-      <w:pPr>
-        <w:spacing w:before="100" w:beforeAutospacing="1" w:after="100" w:afterAutospacing="1" w:line="240" w:lineRule="auto"/>
-        <w:rPr>
-          <w:rFonts w:ascii="Cambay Devanagari" w:eastAsia="Times New Roman" w:hAnsi="Cambay Devanagari" w:cs="Cambay Devanagari"/>
-          <w:kern w:val="0"/>
-          <w14:ligatures w14:val="none"/>
-        </w:rPr>
-      </w:pPr>
-      <w:r>
-        <w:rPr>
-          <w:rFonts w:ascii="Cambay Devanagari" w:eastAsia="Times New Roman" w:hAnsi="Cambay Devanagari" w:cs="Cambay Devanagari"/>
-          <w:kern w:val="0"/>
-          <w14:ligatures w14:val="none"/>
-        </w:rPr>
-        <w:t>This step-by-step workflow provides clear goals for focused work blocks. Remember to commit your code frequently with Git and don't be afraid to adjust sprint lengths based on your progress! Good luck!</w:t>
-      </w:r>
-    </w:p>
-    <w:p>
-      <w:pPr>
-        <w:spacing w:before="100" w:beforeAutospacing="1" w:after="100" w:afterAutospacing="1" w:line="240" w:lineRule="auto"/>
-        <w:rPr>
-          <w:rFonts w:ascii="Cambay Devanagari" w:eastAsia="Times New Roman" w:hAnsi="Cambay Devanagari" w:cs="Cambay Devanagari"/>
-          <w:kern w:val="0"/>
-          <w14:ligatures w14:val="none"/>
-        </w:rPr>
-      </w:pPr>
-      <w:r>
-        <w:rPr>
-          <w:rFonts w:ascii="Cambay Devanagari" w:eastAsia="Times New Roman" w:hAnsi="Cambay Devanagari" w:cs="Cambay Devanagari"/>
-          <w:kern w:val="0"/>
-          <w14:ligatures w14:val="none"/>
-        </w:rPr>
-        <w:t xml:space="preserve">can you write the web development code when </w:t>
-      </w:r>
-      <w:proofErr w:type="spellStart"/>
-      <w:r>
-        <w:rPr>
-          <w:rFonts w:ascii="Cambay Devanagari" w:eastAsia="Times New Roman" w:hAnsi="Cambay Devanagari" w:cs="Cambay Devanagari"/>
-          <w:kern w:val="0"/>
-          <w14:ligatures w14:val="none"/>
-        </w:rPr>
-        <w:t>i</w:t>
-      </w:r>
-      <w:proofErr w:type="spellEnd"/>
-      <w:r>
-        <w:rPr>
-          <w:rFonts w:ascii="Cambay Devanagari" w:eastAsia="Times New Roman" w:hAnsi="Cambay Devanagari" w:cs="Cambay Devanagari"/>
-          <w:kern w:val="0"/>
-          <w14:ligatures w14:val="none"/>
-        </w:rPr>
-        <w:t xml:space="preserve"> get to it? </w:t>
-      </w:r>
-    </w:p>
-    <w:p>
-      <w:pPr>
-        <w:spacing w:after="0" w:line="240" w:lineRule="auto"/>
-        <w:rPr>
-          <w:rFonts w:ascii="Cambay Devanagari" w:eastAsia="Times New Roman" w:hAnsi="Cambay Devanagari" w:cs="Cambay Devanagari"/>
-          <w:kern w:val="0"/>
-          <w14:ligatures w14:val="none"/>
-        </w:rPr>
-      </w:pPr>
-      <w:r>
-        <w:rPr>
-          <w:rFonts w:ascii="Cambay Devanagari" w:eastAsia="Times New Roman" w:hAnsi="Cambay Devanagari" w:cs="Cambay Devanagari"/>
-          <w:kern w:val="0"/>
-          <w14:ligatures w14:val="none"/>
-        </w:rPr>
-        <w:t>Show thinking</w:t>
-      </w:r>
-    </w:p>
-    <w:p>
-      <w:pPr>
-        <w:spacing w:before="100" w:beforeAutospacing="1" w:after="100" w:afterAutospacing="1" w:line="240" w:lineRule="auto"/>
-        <w:rPr>
-          <w:rFonts w:ascii="Cambay Devanagari" w:eastAsia="Times New Roman" w:hAnsi="Cambay Devanagari" w:cs="Cambay Devanagari"/>
-          <w:kern w:val="0"/>
-          <w14:ligatures w14:val="none"/>
-        </w:rPr>
-      </w:pPr>
-      <w:r>
-        <w:rPr>
-          <w:rFonts w:ascii="Cambay Devanagari" w:eastAsia="Times New Roman" w:hAnsi="Cambay Devanagari" w:cs="Cambay Devanagari"/>
-          <w:kern w:val="0"/>
-          <w14:ligatures w14:val="none"/>
-        </w:rPr>
-        <w:t>Okay, I understand you're thinking ahead to the web development phase (Phase 2 and onwards in our plan).</w:t>
-      </w:r>
-    </w:p>
-    <w:p>
-      <w:pPr>
-        <w:spacing w:before="100" w:beforeAutospacing="1" w:after="100" w:afterAutospacing="1" w:line="240" w:lineRule="auto"/>
-        <w:rPr>
-          <w:rFonts w:ascii="Cambay Devanagari" w:eastAsia="Times New Roman" w:hAnsi="Cambay Devanagari" w:cs="Cambay Devanagari"/>
-          <w:kern w:val="0"/>
-          <w14:ligatures w14:val="none"/>
-        </w:rPr>
-      </w:pPr>
-      <w:r>
-        <w:rPr>
-          <w:rFonts w:ascii="Cambay Devanagari" w:eastAsia="Times New Roman" w:hAnsi="Cambay Devanagari" w:cs="Cambay Devanagari"/>
-          <w:kern w:val="0"/>
-          <w14:ligatures w14:val="none"/>
-        </w:rPr>
-        <w:t xml:space="preserve">While I can't write the </w:t>
-      </w:r>
-      <w:r>
-        <w:rPr>
-          <w:rFonts w:ascii="Cambay Devanagari" w:eastAsia="Times New Roman" w:hAnsi="Cambay Devanagari" w:cs="Cambay Devanagari"/>
-          <w:i/>
-          <w:iCs/>
-          <w:kern w:val="0"/>
-          <w14:ligatures w14:val="none"/>
-        </w:rPr>
-        <w:t>entire</w:t>
-      </w:r>
-      <w:r>
-        <w:rPr>
-          <w:rFonts w:ascii="Cambay Devanagari" w:eastAsia="Times New Roman" w:hAnsi="Cambay Devanagari" w:cs="Cambay Devanagari"/>
-          <w:kern w:val="0"/>
-          <w14:ligatures w14:val="none"/>
-        </w:rPr>
-        <w:t xml:space="preserve"> web application code for you from start to finish – because building an application involves lots of iterative steps, debugging, and specific choices based on how </w:t>
-      </w:r>
-      <w:r>
-        <w:rPr>
-          <w:rFonts w:ascii="Cambay Devanagari" w:eastAsia="Times New Roman" w:hAnsi="Cambay Devanagari" w:cs="Cambay Devanagari"/>
-          <w:i/>
-          <w:iCs/>
-          <w:kern w:val="0"/>
-          <w14:ligatures w14:val="none"/>
-        </w:rPr>
-        <w:t>your</w:t>
-      </w:r>
-      <w:r>
-        <w:rPr>
-          <w:rFonts w:ascii="Cambay Devanagari" w:eastAsia="Times New Roman" w:hAnsi="Cambay Devanagari" w:cs="Cambay Devanagari"/>
-          <w:kern w:val="0"/>
-          <w14:ligatures w14:val="none"/>
-        </w:rPr>
-        <w:t xml:space="preserve"> exact code evolves – I can </w:t>
-      </w:r>
-      <w:proofErr w:type="gramStart"/>
-      <w:r>
-        <w:rPr>
-          <w:rFonts w:ascii="Cambay Devanagari" w:eastAsia="Times New Roman" w:hAnsi="Cambay Devanagari" w:cs="Cambay Devanagari"/>
-          <w:kern w:val="0"/>
-          <w14:ligatures w14:val="none"/>
-        </w:rPr>
-        <w:t xml:space="preserve">definitely </w:t>
-      </w:r>
-      <w:r>
-        <w:rPr>
-          <w:rFonts w:ascii="Cambay Devanagari" w:eastAsia="Times New Roman" w:hAnsi="Cambay Devanagari" w:cs="Cambay Devanagari"/>
-          <w:b/>
-          <w:bCs/>
-          <w:kern w:val="0"/>
-          <w14:ligatures w14:val="none"/>
-        </w:rPr>
-        <w:t>help</w:t>
-      </w:r>
-      <w:proofErr w:type="gramEnd"/>
-      <w:r>
-        <w:rPr>
-          <w:rFonts w:ascii="Cambay Devanagari" w:eastAsia="Times New Roman" w:hAnsi="Cambay Devanagari" w:cs="Cambay Devanagari"/>
-          <w:b/>
-          <w:bCs/>
-          <w:kern w:val="0"/>
-          <w14:ligatures w14:val="none"/>
-        </w:rPr>
-        <w:t xml:space="preserve"> you extensively</w:t>
-      </w:r>
-      <w:r>
-        <w:rPr>
-          <w:rFonts w:ascii="Cambay Devanagari" w:eastAsia="Times New Roman" w:hAnsi="Cambay Devanagari" w:cs="Cambay Devanagari"/>
-          <w:kern w:val="0"/>
-          <w14:ligatures w14:val="none"/>
-        </w:rPr>
-        <w:t xml:space="preserve"> when you get to that stage.</w:t>
-      </w:r>
-    </w:p>
-    <w:p>
-      <w:pPr>
-        <w:spacing w:before="100" w:beforeAutospacing="1" w:after="100" w:afterAutospacing="1" w:line="240" w:lineRule="auto"/>
-        <w:rPr>
-          <w:rFonts w:ascii="Cambay Devanagari" w:eastAsia="Times New Roman" w:hAnsi="Cambay Devanagari" w:cs="Cambay Devanagari"/>
-          <w:kern w:val="0"/>
-          <w14:ligatures w14:val="none"/>
-        </w:rPr>
-      </w:pPr>
-      <w:r>
-        <w:rPr>
-          <w:rFonts w:ascii="Cambay Devanagari" w:eastAsia="Times New Roman" w:hAnsi="Cambay Devanagari" w:cs="Cambay Devanagari"/>
-          <w:kern w:val="0"/>
-          <w14:ligatures w14:val="none"/>
-        </w:rPr>
-        <w:t>Think of me as a coding assistant or tutor for that part. Here's how I can assist you with the Flask/web development code:</w:t>
-      </w:r>
-    </w:p>
-    <w:p>
-      <w:pPr>
-        <w:numPr>
-          <w:ilvl w:val="0"/>
-          <w:numId w:val="5"/>
-        </w:numPr>
-        <w:spacing w:before="100" w:beforeAutospacing="1" w:after="100" w:afterAutospacing="1" w:line="240" w:lineRule="auto"/>
-        <w:rPr>
-          <w:rFonts w:ascii="Cambay Devanagari" w:eastAsia="Times New Roman" w:hAnsi="Cambay Devanagari" w:cs="Cambay Devanagari"/>
-          <w:kern w:val="0"/>
-          <w14:ligatures w14:val="none"/>
-        </w:rPr>
-      </w:pPr>
-      <w:r>
-        <w:rPr>
-          <w:rFonts w:ascii="Cambay Devanagari" w:eastAsia="Times New Roman" w:hAnsi="Cambay Devanagari" w:cs="Cambay Devanagari"/>
-          <w:b/>
-          <w:bCs/>
-          <w:kern w:val="0"/>
-          <w14:ligatures w14:val="none"/>
-        </w:rPr>
-        <w:t>Provide Specific Code Snippets:</w:t>
-      </w:r>
-      <w:r>
-        <w:rPr>
-          <w:rFonts w:ascii="Cambay Devanagari" w:eastAsia="Times New Roman" w:hAnsi="Cambay Devanagari" w:cs="Cambay Devanagari"/>
-          <w:kern w:val="0"/>
-          <w14:ligatures w14:val="none"/>
-        </w:rPr>
-        <w:t xml:space="preserve"> When you're working on a particular step (like setting up a Flask route, creating an HTML form, passing data to a template, handling user input), I can provide example code snippets for that specific task.</w:t>
-      </w:r>
-    </w:p>
-    <w:p>
-      <w:pPr>
-        <w:numPr>
-          <w:ilvl w:val="0"/>
-          <w:numId w:val="5"/>
-        </w:numPr>
-        <w:spacing w:before="100" w:beforeAutospacing="1" w:after="100" w:afterAutospacing="1" w:line="240" w:lineRule="auto"/>
-        <w:rPr>
-          <w:rFonts w:ascii="Cambay Devanagari" w:eastAsia="Times New Roman" w:hAnsi="Cambay Devanagari" w:cs="Cambay Devanagari"/>
-          <w:kern w:val="0"/>
-          <w14:ligatures w14:val="none"/>
-        </w:rPr>
-      </w:pPr>
-      <w:r>
-        <w:rPr>
-          <w:rFonts w:ascii="Cambay Devanagari" w:eastAsia="Times New Roman" w:hAnsi="Cambay Devanagari" w:cs="Cambay Devanagari"/>
-          <w:b/>
-          <w:bCs/>
-          <w:kern w:val="0"/>
-          <w14:ligatures w14:val="none"/>
-        </w:rPr>
-        <w:t>Explain Concepts:</w:t>
-      </w:r>
-      <w:r>
-        <w:rPr>
-          <w:rFonts w:ascii="Cambay Devanagari" w:eastAsia="Times New Roman" w:hAnsi="Cambay Devanagari" w:cs="Cambay Devanagari"/>
-          <w:kern w:val="0"/>
-          <w14:ligatures w14:val="none"/>
-        </w:rPr>
-        <w:t xml:space="preserve"> I can explain how Flask works, how HTML forms submit data, how Jinja templating connects Python to HTML, how CSS styles pages, etc.</w:t>
-      </w:r>
-    </w:p>
-    <w:p>
-      <w:pPr>
-        <w:numPr>
-          <w:ilvl w:val="0"/>
-          <w:numId w:val="5"/>
-        </w:numPr>
-        <w:spacing w:before="100" w:beforeAutospacing="1" w:after="100" w:afterAutospacing="1" w:line="240" w:lineRule="auto"/>
-        <w:rPr>
-          <w:rFonts w:ascii="Cambay Devanagari" w:eastAsia="Times New Roman" w:hAnsi="Cambay Devanagari" w:cs="Cambay Devanagari"/>
-          <w:kern w:val="0"/>
-          <w14:ligatures w14:val="none"/>
-        </w:rPr>
-      </w:pPr>
-      <w:r>
-        <w:rPr>
-          <w:rFonts w:ascii="Cambay Devanagari" w:eastAsia="Times New Roman" w:hAnsi="Cambay Devanagari" w:cs="Cambay Devanagari"/>
-          <w:b/>
-          <w:bCs/>
-          <w:kern w:val="0"/>
-          <w14:ligatures w14:val="none"/>
-        </w:rPr>
-        <w:t>Debug Errors:</w:t>
-      </w:r>
-      <w:r>
-        <w:rPr>
-          <w:rFonts w:ascii="Cambay Devanagari" w:eastAsia="Times New Roman" w:hAnsi="Cambay Devanagari" w:cs="Cambay Devanagari"/>
-          <w:kern w:val="0"/>
-          <w14:ligatures w14:val="none"/>
-        </w:rPr>
-        <w:t xml:space="preserve"> If you write some code and run into an error message you don't understand, you can share the code and the error, and I can help you figure out what's wrong.</w:t>
-      </w:r>
-    </w:p>
-    <w:p>
-      <w:pPr>
-        <w:numPr>
-          <w:ilvl w:val="0"/>
-          <w:numId w:val="5"/>
-        </w:numPr>
-        <w:spacing w:before="100" w:beforeAutospacing="1" w:after="100" w:afterAutospacing="1" w:line="240" w:lineRule="auto"/>
-        <w:rPr>
-          <w:rFonts w:ascii="Cambay Devanagari" w:eastAsia="Times New Roman" w:hAnsi="Cambay Devanagari" w:cs="Cambay Devanagari"/>
-          <w:kern w:val="0"/>
-          <w14:ligatures w14:val="none"/>
-        </w:rPr>
-      </w:pPr>
-      <w:r>
-        <w:rPr>
-          <w:rFonts w:ascii="Cambay Devanagari" w:eastAsia="Times New Roman" w:hAnsi="Cambay Devanagari" w:cs="Cambay Devanagari"/>
-          <w:b/>
-          <w:bCs/>
-          <w:kern w:val="0"/>
-          <w14:ligatures w14:val="none"/>
-        </w:rPr>
-        <w:t>Show Best Practices:</w:t>
-      </w:r>
-      <w:r>
-        <w:rPr>
-          <w:rFonts w:ascii="Cambay Devanagari" w:eastAsia="Times New Roman" w:hAnsi="Cambay Devanagari" w:cs="Cambay Devanagari"/>
-          <w:kern w:val="0"/>
-          <w14:ligatures w14:val="none"/>
-        </w:rPr>
-        <w:t xml:space="preserve"> I can offer suggestions on how to structure your Flask application, organize your templates, or write cleaner Python code.</w:t>
-      </w:r>
-    </w:p>
-    <w:p>
-      <w:pPr>
-        <w:numPr>
-          <w:ilvl w:val="0"/>
-          <w:numId w:val="5"/>
-        </w:numPr>
-        <w:spacing w:before="100" w:beforeAutospacing="1" w:after="100" w:afterAutospacing="1" w:line="240" w:lineRule="auto"/>
-        <w:rPr>
-          <w:rFonts w:ascii="Cambay Devanagari" w:eastAsia="Times New Roman" w:hAnsi="Cambay Devanagari" w:cs="Cambay Devanagari"/>
-          <w:kern w:val="0"/>
-          <w14:ligatures w14:val="none"/>
-        </w:rPr>
-      </w:pPr>
-      <w:r>
-        <w:rPr>
-          <w:rFonts w:ascii="Cambay Devanagari" w:eastAsia="Times New Roman" w:hAnsi="Cambay Devanagari" w:cs="Cambay Devanagari"/>
-          <w:b/>
-          <w:bCs/>
-          <w:kern w:val="0"/>
-          <w14:ligatures w14:val="none"/>
-        </w:rPr>
-        <w:t>Give Examples:</w:t>
-      </w:r>
-      <w:r>
-        <w:rPr>
-          <w:rFonts w:ascii="Cambay Devanagari" w:eastAsia="Times New Roman" w:hAnsi="Cambay Devanagari" w:cs="Cambay Devanagari"/>
-          <w:kern w:val="0"/>
-          <w14:ligatures w14:val="none"/>
-        </w:rPr>
-        <w:t xml:space="preserve"> I can show you examples of how to implement specific features, like using Flask sessions for scoring or basic CSS for styling.</w:t>
-      </w:r>
-    </w:p>
-    <w:p>
-      <w:pPr>
-        <w:spacing w:before="100" w:beforeAutospacing="1" w:after="100" w:afterAutospacing="1" w:line="240" w:lineRule="auto"/>
-        <w:rPr>
-          <w:rFonts w:ascii="Cambay Devanagari" w:eastAsia="Times New Roman" w:hAnsi="Cambay Devanagari" w:cs="Cambay Devanagari"/>
-          <w:kern w:val="0"/>
-          <w14:ligatures w14:val="none"/>
-        </w:rPr>
-      </w:pPr>
-      <w:r>
-        <w:rPr>
-          <w:rFonts w:ascii="Cambay Devanagari" w:eastAsia="Times New Roman" w:hAnsi="Cambay Devanagari" w:cs="Cambay Devanagari"/>
-          <w:kern w:val="0"/>
-          <w14:ligatures w14:val="none"/>
-        </w:rPr>
-        <w:t xml:space="preserve">The goal of this project is for you to learn and build these skills yourself, which is incredibly valuable for your portfolio! </w:t>
-      </w:r>
-      <w:proofErr w:type="gramStart"/>
-      <w:r>
-        <w:rPr>
-          <w:rFonts w:ascii="Cambay Devanagari" w:eastAsia="Times New Roman" w:hAnsi="Cambay Devanagari" w:cs="Cambay Devanagari"/>
-          <w:kern w:val="0"/>
-          <w14:ligatures w14:val="none"/>
-        </w:rPr>
-        <w:t>Actually</w:t>
-      </w:r>
-      <w:proofErr w:type="gramEnd"/>
-      <w:r>
-        <w:rPr>
-          <w:rFonts w:ascii="Cambay Devanagari" w:eastAsia="Times New Roman" w:hAnsi="Cambay Devanagari" w:cs="Cambay Devanagari"/>
-          <w:kern w:val="0"/>
-          <w14:ligatures w14:val="none"/>
-        </w:rPr>
-        <w:t xml:space="preserve"> writing the code, troubleshooting it, and seeing it work is the best way to learn.</w:t>
-      </w:r>
-    </w:p>
-    <w:p>
-      <w:pPr>
-        <w:spacing w:before="100" w:beforeAutospacing="1" w:after="100" w:afterAutospacing="1" w:line="240" w:lineRule="auto"/>
-        <w:rPr>
-          <w:rFonts w:ascii="Cambay Devanagari" w:eastAsia="Times New Roman" w:hAnsi="Cambay Devanagari" w:cs="Cambay Devanagari"/>
-          <w:kern w:val="0"/>
-          <w14:ligatures w14:val="none"/>
-        </w:rPr>
-      </w:pPr>
-      <w:r>
-        <w:rPr>
-          <w:rFonts w:ascii="Cambay Devanagari" w:eastAsia="Times New Roman" w:hAnsi="Cambay Devanagari" w:cs="Cambay Devanagari"/>
-          <w:kern w:val="0"/>
-          <w14:ligatures w14:val="none"/>
-        </w:rPr>
-        <w:t>So, when you reach Phase 2 (Sprints 2.1 onwards), feel free to ask questions like:</w:t>
-      </w:r>
-    </w:p>
-    <w:p>
-      <w:pPr>
-        <w:numPr>
-          <w:ilvl w:val="0"/>
-          <w:numId w:val="6"/>
-        </w:numPr>
-        <w:spacing w:before="100" w:beforeAutospacing="1" w:after="100" w:afterAutospacing="1" w:line="240" w:lineRule="auto"/>
-        <w:rPr>
-          <w:rFonts w:ascii="Cambay Devanagari" w:eastAsia="Times New Roman" w:hAnsi="Cambay Devanagari" w:cs="Cambay Devanagari"/>
-          <w:kern w:val="0"/>
-          <w14:ligatures w14:val="none"/>
-        </w:rPr>
-      </w:pPr>
-      <w:r>
-        <w:rPr>
-          <w:rFonts w:ascii="Cambay Devanagari" w:eastAsia="Times New Roman" w:hAnsi="Cambay Devanagari" w:cs="Cambay Devanagari"/>
-          <w:kern w:val="0"/>
-          <w14:ligatures w14:val="none"/>
-        </w:rPr>
-        <w:lastRenderedPageBreak/>
-        <w:t>"How do I set up a basic Flask app file?"</w:t>
-      </w:r>
-    </w:p>
-    <w:p>
-      <w:pPr>
-        <w:numPr>
-          <w:ilvl w:val="0"/>
-          <w:numId w:val="6"/>
-        </w:numPr>
-        <w:spacing w:before="100" w:beforeAutospacing="1" w:after="100" w:afterAutospacing="1" w:line="240" w:lineRule="auto"/>
-        <w:rPr>
-          <w:rFonts w:ascii="Cambay Devanagari" w:eastAsia="Times New Roman" w:hAnsi="Cambay Devanagari" w:cs="Cambay Devanagari"/>
-          <w:kern w:val="0"/>
-          <w14:ligatures w14:val="none"/>
-        </w:rPr>
-      </w:pPr>
-      <w:r>
-        <w:rPr>
-          <w:rFonts w:ascii="Cambay Devanagari" w:eastAsia="Times New Roman" w:hAnsi="Cambay Devanagari" w:cs="Cambay Devanagari"/>
-          <w:kern w:val="0"/>
-          <w14:ligatures w14:val="none"/>
-        </w:rPr>
-        <w:t>"Can you show me an example of an HTML template with a form for submitting an answer?"</w:t>
-      </w:r>
-    </w:p>
-    <w:p>
-      <w:pPr>
-        <w:numPr>
-          <w:ilvl w:val="0"/>
-          <w:numId w:val="6"/>
-        </w:numPr>
-        <w:spacing w:before="100" w:beforeAutospacing="1" w:after="100" w:afterAutospacing="1" w:line="240" w:lineRule="auto"/>
-        <w:rPr>
-          <w:rFonts w:ascii="Cambay Devanagari" w:eastAsia="Times New Roman" w:hAnsi="Cambay Devanagari" w:cs="Cambay Devanagari"/>
-          <w:kern w:val="0"/>
-          <w14:ligatures w14:val="none"/>
-        </w:rPr>
-      </w:pPr>
-      <w:r>
-        <w:rPr>
-          <w:rFonts w:ascii="Cambay Devanagari" w:eastAsia="Times New Roman" w:hAnsi="Cambay Devanagari" w:cs="Cambay Devanagari"/>
-          <w:kern w:val="0"/>
-          <w14:ligatures w14:val="none"/>
-        </w:rPr>
-        <w:t>"How do I get the data from the form back into my Python function in Flask?"</w:t>
-      </w:r>
-    </w:p>
-    <w:p>
-      <w:pPr>
-        <w:numPr>
-          <w:ilvl w:val="0"/>
-          <w:numId w:val="6"/>
-        </w:numPr>
-        <w:spacing w:before="100" w:beforeAutospacing="1" w:after="100" w:afterAutospacing="1" w:line="240" w:lineRule="auto"/>
-        <w:rPr>
-          <w:rFonts w:ascii="Cambay Devanagari" w:eastAsia="Times New Roman" w:hAnsi="Cambay Devanagari" w:cs="Cambay Devanagari"/>
-          <w:kern w:val="0"/>
-          <w14:ligatures w14:val="none"/>
-        </w:rPr>
-      </w:pPr>
-      <w:r>
-        <w:rPr>
-          <w:rFonts w:ascii="Cambay Devanagari" w:eastAsia="Times New Roman" w:hAnsi="Cambay Devanagari" w:cs="Cambay Devanagari"/>
-          <w:kern w:val="0"/>
-          <w14:ligatures w14:val="none"/>
-        </w:rPr>
-        <w:t>"I'm getting this error message in Flask, what does it mean?"</w:t>
-      </w:r>
-    </w:p>
-    <w:p>
-      <w:pPr>
-        <w:numPr>
-          <w:ilvl w:val="0"/>
-          <w:numId w:val="6"/>
-        </w:numPr>
-        <w:spacing w:before="100" w:beforeAutospacing="1" w:after="100" w:afterAutospacing="1" w:line="240" w:lineRule="auto"/>
-        <w:rPr>
-          <w:rFonts w:ascii="Cambay Devanagari" w:eastAsia="Times New Roman" w:hAnsi="Cambay Devanagari" w:cs="Cambay Devanagari"/>
-          <w:kern w:val="0"/>
-          <w14:ligatures w14:val="none"/>
-        </w:rPr>
-      </w:pPr>
-      <w:r>
-        <w:rPr>
-          <w:rFonts w:ascii="Cambay Devanagari" w:eastAsia="Times New Roman" w:hAnsi="Cambay Devanagari" w:cs="Cambay Devanagari"/>
-          <w:kern w:val="0"/>
-          <w14:ligatures w14:val="none"/>
-        </w:rPr>
-        <w:t>"How can I pass the score from my Python code to the HTML page?"</w:t>
-      </w:r>
-    </w:p>
-    <w:p>
-      <w:pPr>
-        <w:rPr>
-          <w:rFonts w:ascii="Cambay Devanagari" w:hAnsi="Cambay Devanagari" w:cs="Cambay Devanagari"/>
-        </w:rPr>
-      </w:pPr>
     </w:p>
     <w:sectPr>
       <w:pgSz w:w="12240" w:h="15840"/>

</xml_diff>